<commit_message>
feat: complete coherence review and integrate 5 black-and-white coloring page images for Book 1
</commit_message>
<xml_diff>
--- a/final/las_aventuras_de_nico_y_luna_el_bosque_magico.docx
+++ b/final/las_aventuras_de_nico_y_luna_el_bosque_magico.docx
@@ -353,19 +353,57 @@
     </w:p>
     <w:p>
       <w:pPr>
-        <w:pStyle w:val="FirstParagraph"/>
-      </w:pPr>
-      <w:r>
-        <w:rPr>
-          <w:b/>
-        </w:rPr>
-        <w:t xml:space="preserve">[Prompt de Ilustración para Colorear - Pág. 4]:</w:t>
-      </w:r>
-      <w:r>
-        <w:br/>
-      </w:r>
-      <w:r>
-        <w:t xml:space="preserve">Nico agachado mostrando la hoja dorada con mapa simple. Luna y Copito mirando fascinados con ojos abiertos. Jardín de fondo con flores y un rosal grande. Líneas negras gruesas, estilo libro para colorear infantil, fondo limpio sin sombreado.</w:t>
+        <w:pStyle w:val="CaptionedFigure"/>
+      </w:pPr>
+      <w:r>
+        <w:drawing>
+          <wp:inline>
+            <wp:extent cx="2731008" cy="3657600"/>
+            <wp:effectExtent b="0" l="0" r="0" t="0"/>
+            <wp:docPr descr="Página para Colorear 1: El Mapa Mágico" title="" id="1" name="Picture"/>
+            <a:graphic>
+              <a:graphicData uri="http://schemas.openxmlformats.org/drawingml/2006/picture">
+                <pic:pic>
+                  <pic:nvPicPr>
+                    <pic:cNvPr descr="../images/coloring_page_1_mapa.jpg" id="0" name="Picture"/>
+                    <pic:cNvPicPr>
+                      <a:picLocks noChangeArrowheads="1" noChangeAspect="1"/>
+                    </pic:cNvPicPr>
+                  </pic:nvPicPr>
+                  <pic:blipFill>
+                    <a:blip r:embed="rId28"/>
+                    <a:stretch>
+                      <a:fillRect/>
+                    </a:stretch>
+                  </pic:blipFill>
+                  <pic:spPr bwMode="auto">
+                    <a:xfrm>
+                      <a:off x="0" y="0"/>
+                      <a:ext cx="2731008" cy="3657600"/>
+                    </a:xfrm>
+                    <a:prstGeom prst="rect">
+                      <a:avLst/>
+                    </a:prstGeom>
+                    <a:noFill/>
+                    <a:ln w="9525">
+                      <a:noFill/>
+                      <a:headEnd/>
+                      <a:tailEnd/>
+                    </a:ln>
+                  </pic:spPr>
+                </pic:pic>
+              </a:graphicData>
+            </a:graphic>
+          </wp:inline>
+        </w:drawing>
+      </w:r>
+    </w:p>
+    <w:p>
+      <w:pPr>
+        <w:pStyle w:val="ImageCaption"/>
+      </w:pPr>
+      <w:r>
+        <w:t xml:space="preserve">Página para Colorear 1: El Mapa Mágico</w:t>
       </w:r>
     </w:p>
     <w:p>
@@ -379,11 +417,11 @@
       <w:pPr>
         <w:pStyle w:val="Heading2"/>
       </w:pPr>
-      <w:bookmarkStart w:id="28" w:name="Xe03c30c15ee159b7f22f757af2cd2c3480799cc"/>
+      <w:bookmarkStart w:id="29" w:name="Xe03c30c15ee159b7f22f757af2cd2c3480799cc"/>
       <w:r>
         <w:t xml:space="preserve">[PÁGINA 5: ESCENA 2 - EL ARCO DE RAMAS VERDES]</w:t>
       </w:r>
-      <w:bookmarkEnd w:id="28"/>
+      <w:bookmarkEnd w:id="29"/>
     </w:p>
     <w:p>
       <w:pPr>
@@ -420,23 +458,6 @@
       </w:r>
       <w:r>
         <w:t xml:space="preserve">—¡Bienvenid@s al Bosque Mágico! —susurra Luna con alegría.</w:t>
-      </w:r>
-    </w:p>
-    <w:p>
-      <w:pPr>
-        <w:pStyle w:val="FirstParagraph"/>
-      </w:pPr>
-      <w:r>
-        <w:rPr>
-          <w:b/>
-        </w:rPr>
-        <w:t xml:space="preserve">[Prompt de Ilustración para Colorear - Pág. 5]:</w:t>
-      </w:r>
-      <w:r>
-        <w:br/>
-      </w:r>
-      <w:r>
-        <w:t xml:space="preserve">Nico, Luna y el perrito Copito cruzando un gran arco natural hecho de ramas y enredaderas florales. Árboles altos sonrientes al fondo. Dibujo lineal limpio para colorear, contornos marcados.</w:t>
       </w:r>
     </w:p>
     <w:p>
@@ -450,11 +471,11 @@
       <w:pPr>
         <w:pStyle w:val="Heading2"/>
       </w:pPr>
-      <w:bookmarkStart w:id="29" w:name="Xc404bc3b94ff0cf807848b7af46793ca2d6348d"/>
+      <w:bookmarkStart w:id="30" w:name="Xc404bc3b94ff0cf807848b7af46793ca2d6348d"/>
       <w:r>
         <w:t xml:space="preserve">[PÁGINA 6: ESCENA 3 - LAS SETAS GIGANTES DE LUNARES]</w:t>
       </w:r>
-      <w:bookmarkEnd w:id="29"/>
+      <w:bookmarkEnd w:id="30"/>
     </w:p>
     <w:p>
       <w:pPr>
@@ -473,7 +494,7 @@
         <w:br/>
       </w:r>
       <w:r>
-        <w:t xml:space="preserve">Una simpatica mariquita saluda desde lo alto de una seta.</w:t>
+        <w:t xml:space="preserve">Una simpática mariquita saluda desde lo alto de una seta.</w:t>
       </w:r>
     </w:p>
     <w:p>
@@ -495,19 +516,57 @@
     </w:p>
     <w:p>
       <w:pPr>
-        <w:pStyle w:val="FirstParagraph"/>
-      </w:pPr>
-      <w:r>
-        <w:rPr>
-          <w:b/>
-        </w:rPr>
-        <w:t xml:space="preserve">[Prompt de Ilustración para Colorear - Pág. 6]:</w:t>
-      </w:r>
-      <w:r>
-        <w:br/>
-      </w:r>
-      <w:r>
-        <w:t xml:space="preserve">Tres setas gigantes de formas redondeadas con lunares grandes para colorear. Nico y Luna caminando entre ellas admirados. Mariquita sonriente sobre la seta principal. Contornos claros y espacios amplios para niños.</w:t>
+        <w:pStyle w:val="CaptionedFigure"/>
+      </w:pPr>
+      <w:r>
+        <w:drawing>
+          <wp:inline>
+            <wp:extent cx="2731008" cy="3657600"/>
+            <wp:effectExtent b="0" l="0" r="0" t="0"/>
+            <wp:docPr descr="Página para Colorear 2: Las Setas Gigantes" title="" id="1" name="Picture"/>
+            <a:graphic>
+              <a:graphicData uri="http://schemas.openxmlformats.org/drawingml/2006/picture">
+                <pic:pic>
+                  <pic:nvPicPr>
+                    <pic:cNvPr descr="../images/coloring_page_2_setas.jpg" id="0" name="Picture"/>
+                    <pic:cNvPicPr>
+                      <a:picLocks noChangeArrowheads="1" noChangeAspect="1"/>
+                    </pic:cNvPicPr>
+                  </pic:nvPicPr>
+                  <pic:blipFill>
+                    <a:blip r:embed="rId31"/>
+                    <a:stretch>
+                      <a:fillRect/>
+                    </a:stretch>
+                  </pic:blipFill>
+                  <pic:spPr bwMode="auto">
+                    <a:xfrm>
+                      <a:off x="0" y="0"/>
+                      <a:ext cx="2731008" cy="3657600"/>
+                    </a:xfrm>
+                    <a:prstGeom prst="rect">
+                      <a:avLst/>
+                    </a:prstGeom>
+                    <a:noFill/>
+                    <a:ln w="9525">
+                      <a:noFill/>
+                      <a:headEnd/>
+                      <a:tailEnd/>
+                    </a:ln>
+                  </pic:spPr>
+                </pic:pic>
+              </a:graphicData>
+            </a:graphic>
+          </wp:inline>
+        </w:drawing>
+      </w:r>
+    </w:p>
+    <w:p>
+      <w:pPr>
+        <w:pStyle w:val="ImageCaption"/>
+      </w:pPr>
+      <w:r>
+        <w:t xml:space="preserve">Página para Colorear 2: Las Setas Gigantes</w:t>
       </w:r>
     </w:p>
     <w:p>
@@ -521,11 +580,11 @@
       <w:pPr>
         <w:pStyle w:val="Heading2"/>
       </w:pPr>
-      <w:bookmarkStart w:id="30" w:name="X7f90523d9c87da1af88a903fb804e13449d1662"/>
+      <w:bookmarkStart w:id="32" w:name="X7f90523d9c87da1af88a903fb804e13449d1662"/>
       <w:r>
         <w:t xml:space="preserve">[PÁGINA 7: ESCENA 4 - LAS MARIPOSAS DANCARINAS]</w:t>
       </w:r>
-      <w:bookmarkEnd w:id="30"/>
+      <w:bookmarkEnd w:id="32"/>
     </w:p>
     <w:p>
       <w:pPr>
@@ -562,23 +621,6 @@
       </w:r>
       <w:r>
         <w:t xml:space="preserve">Las mariposas les dan la bienvenida con un divertido baile volador.</w:t>
-      </w:r>
-    </w:p>
-    <w:p>
-      <w:pPr>
-        <w:pStyle w:val="FirstParagraph"/>
-      </w:pPr>
-      <w:r>
-        <w:rPr>
-          <w:b/>
-        </w:rPr>
-        <w:t xml:space="preserve">[Prompt de Ilustración para Colorear - Pág. 7]:</w:t>
-      </w:r>
-      <w:r>
-        <w:br/>
-      </w:r>
-      <w:r>
-        <w:t xml:space="preserve">Mariposas gigantes con bonitos patrones geométricos en sus alas revoloteando alrededor de Nico, Luna y Copito. Flores sencillas en el suelo. Estilo libre de sombreado, contornos gruesos.</w:t>
       </w:r>
     </w:p>
     <w:p>
@@ -592,11 +634,11 @@
       <w:pPr>
         <w:pStyle w:val="Heading2"/>
       </w:pPr>
-      <w:bookmarkStart w:id="31" w:name="X877135049f9591777c1f59f33b95faf4813c383"/>
+      <w:bookmarkStart w:id="33" w:name="X877135049f9591777c1f59f33b95faf4813c383"/>
       <w:r>
         <w:t xml:space="preserve">[PÁGINA 8: ESCENA 5 - LAS ARDILLAS MALABARISTAS]</w:t>
       </w:r>
-      <w:bookmarkEnd w:id="31"/>
+      <w:bookmarkEnd w:id="33"/>
     </w:p>
     <w:p>
       <w:pPr>
@@ -633,23 +675,6 @@
       </w:r>
       <w:r>
         <w:t xml:space="preserve">—¡Qué habilidad tienen estas ardillas! —aplaude Luna entusiasmada.</w:t>
-      </w:r>
-    </w:p>
-    <w:p>
-      <w:pPr>
-        <w:pStyle w:val="FirstParagraph"/>
-      </w:pPr>
-      <w:r>
-        <w:rPr>
-          <w:b/>
-        </w:rPr>
-        <w:t xml:space="preserve">[Prompt de Ilustración para Colorear - Pág. 8]:</w:t>
-      </w:r>
-      <w:r>
-        <w:br/>
-      </w:r>
-      <w:r>
-        <w:t xml:space="preserve">Dos simpáticas ardillas sobre una rama gruesa haciendo malabares con bellotas grandes. Nico y Luna aplaudiendo abajo en el camino. Dibujo infantil claro y fácil de colorear.</w:t>
       </w:r>
       <w:r>
         <w:t xml:space="preserve"> </w:t>
@@ -669,11 +694,11 @@
       <w:pPr>
         <w:pStyle w:val="Heading2"/>
       </w:pPr>
-      <w:bookmarkStart w:id="32" w:name="X02a5bf629b2837f16c5ef6759a68d3b184dc071"/>
+      <w:bookmarkStart w:id="34" w:name="X02a5bf629b2837f16c5ef6759a68d3b184dc071"/>
       <w:r>
         <w:t xml:space="preserve">[PÁGINA 9: ESCENA 6 - EL GRAN ROBLE CENTENARIO]</w:t>
       </w:r>
-      <w:bookmarkEnd w:id="32"/>
+      <w:bookmarkEnd w:id="34"/>
     </w:p>
     <w:p>
       <w:pPr>
@@ -710,23 +735,6 @@
       </w:r>
       <w:r>
         <w:t xml:space="preserve">El árbol más antiguo del bosque custodia los secretos más hermosos.</w:t>
-      </w:r>
-    </w:p>
-    <w:p>
-      <w:pPr>
-        <w:pStyle w:val="FirstParagraph"/>
-      </w:pPr>
-      <w:r>
-        <w:rPr>
-          <w:b/>
-        </w:rPr>
-        <w:t xml:space="preserve">[Prompt de Ilustración para Colorear - Pág. 9]:</w:t>
-      </w:r>
-      <w:r>
-        <w:br/>
-      </w:r>
-      <w:r>
-        <w:t xml:space="preserve">Un enorme árbol roble sonriente con hojas frondosas y una ventanita redonda en el tronco. Farolillos colgando de las ramas. Nico y Luna contemplándolo con admiración. Contornos negros limpios para niños de 4-8 años.</w:t>
       </w:r>
     </w:p>
     <w:p>
@@ -740,11 +748,11 @@
       <w:pPr>
         <w:pStyle w:val="Heading2"/>
       </w:pPr>
-      <w:bookmarkStart w:id="33" w:name="Xc8868d30a75d48260017fedaae3533a57d290cf"/>
+      <w:bookmarkStart w:id="35" w:name="Xc8868d30a75d48260017fedaae3533a57d290cf"/>
       <w:r>
         <w:t xml:space="preserve">[PÁGINA 10: ESCENA 7 - EL BÚHO SABIO CON GAFAS]</w:t>
       </w:r>
-      <w:bookmarkEnd w:id="33"/>
+      <w:bookmarkEnd w:id="35"/>
     </w:p>
     <w:p>
       <w:pPr>
@@ -785,19 +793,57 @@
     </w:p>
     <w:p>
       <w:pPr>
-        <w:pStyle w:val="FirstParagraph"/>
-      </w:pPr>
-      <w:r>
-        <w:rPr>
-          <w:b/>
-        </w:rPr>
-        <w:t xml:space="preserve">[Prompt de Ilustración para Colorear - Pág. 10]:</w:t>
-      </w:r>
-      <w:r>
-        <w:br/>
-      </w:r>
-      <w:r>
-        <w:t xml:space="preserve">Búho Sabio simpático posado en la ventana del roble con gafas redondas grandes y un libro abierto. Nico y Luna saludando amablemente desde el suelo. Dibujo de contornos gruesos y expresivos.</w:t>
+        <w:pStyle w:val="CaptionedFigure"/>
+      </w:pPr>
+      <w:r>
+        <w:drawing>
+          <wp:inline>
+            <wp:extent cx="2731008" cy="3657600"/>
+            <wp:effectExtent b="0" l="0" r="0" t="0"/>
+            <wp:docPr descr="Página para Colorear 3: El Búho Sabio" title="" id="1" name="Picture"/>
+            <a:graphic>
+              <a:graphicData uri="http://schemas.openxmlformats.org/drawingml/2006/picture">
+                <pic:pic>
+                  <pic:nvPicPr>
+                    <pic:cNvPr descr="../images/coloring_page_3_buho.jpg" id="0" name="Picture"/>
+                    <pic:cNvPicPr>
+                      <a:picLocks noChangeArrowheads="1" noChangeAspect="1"/>
+                    </pic:cNvPicPr>
+                  </pic:nvPicPr>
+                  <pic:blipFill>
+                    <a:blip r:embed="rId36"/>
+                    <a:stretch>
+                      <a:fillRect/>
+                    </a:stretch>
+                  </pic:blipFill>
+                  <pic:spPr bwMode="auto">
+                    <a:xfrm>
+                      <a:off x="0" y="0"/>
+                      <a:ext cx="2731008" cy="3657600"/>
+                    </a:xfrm>
+                    <a:prstGeom prst="rect">
+                      <a:avLst/>
+                    </a:prstGeom>
+                    <a:noFill/>
+                    <a:ln w="9525">
+                      <a:noFill/>
+                      <a:headEnd/>
+                      <a:tailEnd/>
+                    </a:ln>
+                  </pic:spPr>
+                </pic:pic>
+              </a:graphicData>
+            </a:graphic>
+          </wp:inline>
+        </w:drawing>
+      </w:r>
+    </w:p>
+    <w:p>
+      <w:pPr>
+        <w:pStyle w:val="ImageCaption"/>
+      </w:pPr>
+      <w:r>
+        <w:t xml:space="preserve">Página para Colorear 3: El Búho Sabio</w:t>
       </w:r>
     </w:p>
     <w:p>
@@ -811,11 +857,11 @@
       <w:pPr>
         <w:pStyle w:val="Heading2"/>
       </w:pPr>
-      <w:bookmarkStart w:id="34" w:name="X4e3a8a710d995ac076e10a7f0ca5b7b08bd4764"/>
+      <w:bookmarkStart w:id="37" w:name="X4e3a8a710d995ac076e10a7f0ca5b7b08bd4764"/>
       <w:r>
         <w:t xml:space="preserve">[PÁGINA 11: ESCENA 8 - EL CONSEJO DEL BÚHO SABIO]</w:t>
       </w:r>
-      <w:bookmarkEnd w:id="34"/>
+      <w:bookmarkEnd w:id="37"/>
     </w:p>
     <w:p>
       <w:pPr>
@@ -852,23 +898,6 @@
       </w:r>
       <w:r>
         <w:t xml:space="preserve">—La mejor magia es la bondad y la amistad —enseña el Búho Sabio.</w:t>
-      </w:r>
-    </w:p>
-    <w:p>
-      <w:pPr>
-        <w:pStyle w:val="FirstParagraph"/>
-      </w:pPr>
-      <w:r>
-        <w:rPr>
-          <w:b/>
-        </w:rPr>
-        <w:t xml:space="preserve">[Prompt de Ilustración para Colorear - Pág. 11]:</w:t>
-      </w:r>
-      <w:r>
-        <w:br/>
-      </w:r>
-      <w:r>
-        <w:t xml:space="preserve">Búho Sabio señalando amistosamente hacia el camino con su ala. Nico y Luna escuchando atentos con sonrisas dulces. Hojas de roble y estrellas sencillas en el fondo.</w:t>
       </w:r>
     </w:p>
     <w:p>
@@ -882,11 +911,11 @@
       <w:pPr>
         <w:pStyle w:val="Heading2"/>
       </w:pPr>
-      <w:bookmarkStart w:id="35" w:name="X873b74566e01f72836087fd345be7960385fc1f"/>
+      <w:bookmarkStart w:id="38" w:name="X873b74566e01f72836087fd345be7960385fc1f"/>
       <w:r>
         <w:t xml:space="preserve">[PÁGINA 12: ESCENA 9 - EL PEQUEÑO ERIZO EN APUROS]</w:t>
       </w:r>
-      <w:bookmarkEnd w:id="35"/>
+      <w:bookmarkEnd w:id="38"/>
     </w:p>
     <w:p>
       <w:pPr>
@@ -927,19 +956,57 @@
     </w:p>
     <w:p>
       <w:pPr>
-        <w:pStyle w:val="FirstParagraph"/>
-      </w:pPr>
-      <w:r>
-        <w:rPr>
-          <w:b/>
-        </w:rPr>
-        <w:t xml:space="preserve">[Prompt de Ilustración para Colorear - Pág. 12]:</w:t>
-      </w:r>
-      <w:r>
-        <w:br/>
-      </w:r>
-      <w:r>
-        <w:t xml:space="preserve">Un tierno erizito sentado sobre hojas secas mirando arriba con ojos redondos. Nico inclinado abriendo las hojas para descubrirlo. Copito olfateando con curiosidad. Estilo de líneas negras marcadas, apto para colorear.</w:t>
+        <w:pStyle w:val="CaptionedFigure"/>
+      </w:pPr>
+      <w:r>
+        <w:drawing>
+          <wp:inline>
+            <wp:extent cx="2731008" cy="3657600"/>
+            <wp:effectExtent b="0" l="0" r="0" t="0"/>
+            <wp:docPr descr="Página para Colorear 4: El Encuentro con el Erizo" title="" id="1" name="Picture"/>
+            <a:graphic>
+              <a:graphicData uri="http://schemas.openxmlformats.org/drawingml/2006/picture">
+                <pic:pic>
+                  <pic:nvPicPr>
+                    <pic:cNvPr descr="../images/coloring_page_4_erizo.jpg" id="0" name="Picture"/>
+                    <pic:cNvPicPr>
+                      <a:picLocks noChangeArrowheads="1" noChangeAspect="1"/>
+                    </pic:cNvPicPr>
+                  </pic:nvPicPr>
+                  <pic:blipFill>
+                    <a:blip r:embed="rId39"/>
+                    <a:stretch>
+                      <a:fillRect/>
+                    </a:stretch>
+                  </pic:blipFill>
+                  <pic:spPr bwMode="auto">
+                    <a:xfrm>
+                      <a:off x="0" y="0"/>
+                      <a:ext cx="2731008" cy="3657600"/>
+                    </a:xfrm>
+                    <a:prstGeom prst="rect">
+                      <a:avLst/>
+                    </a:prstGeom>
+                    <a:noFill/>
+                    <a:ln w="9525">
+                      <a:noFill/>
+                      <a:headEnd/>
+                      <a:tailEnd/>
+                    </a:ln>
+                  </pic:spPr>
+                </pic:pic>
+              </a:graphicData>
+            </a:graphic>
+          </wp:inline>
+        </w:drawing>
+      </w:r>
+    </w:p>
+    <w:p>
+      <w:pPr>
+        <w:pStyle w:val="ImageCaption"/>
+      </w:pPr>
+      <w:r>
+        <w:t xml:space="preserve">Página para Colorear 4: El Encuentro con el Erizo</w:t>
       </w:r>
     </w:p>
     <w:p>
@@ -953,18 +1020,18 @@
       <w:pPr>
         <w:pStyle w:val="Heading2"/>
       </w:pPr>
-      <w:bookmarkStart w:id="36" w:name="Xd4bb9a049d0a432b48ad79e6dc66558ef33fe6f"/>
+      <w:bookmarkStart w:id="40" w:name="Xd4bb9a049d0a432b48ad79e6dc66558ef33fe6f"/>
       <w:r>
         <w:t xml:space="preserve">[PÁGINA 13: ESCENA 10 - LA PROMESA DE NICO Y LUNA]</w:t>
       </w:r>
-      <w:bookmarkEnd w:id="36"/>
-    </w:p>
-    <w:p>
-      <w:pPr>
-        <w:pStyle w:val="FirstParagraph"/>
-      </w:pPr>
-      <w:r>
-        <w:t xml:space="preserve">Luna se agacha con ternura y le acaricia la hociquito al erizito.</w:t>
+      <w:bookmarkEnd w:id="40"/>
+    </w:p>
+    <w:p>
+      <w:pPr>
+        <w:pStyle w:val="FirstParagraph"/>
+      </w:pPr>
+      <w:r>
+        <w:t xml:space="preserve">Luna se agacha con ternura y le acaricia el hociquito al erizito.</w:t>
       </w:r>
       <w:r>
         <w:br/>
@@ -994,23 +1061,6 @@
       </w:r>
       <w:r>
         <w:t xml:space="preserve">—¡Con el mapa y nuestro trabajo en equipo, lo lograremos! —promete Nico.</w:t>
-      </w:r>
-    </w:p>
-    <w:p>
-      <w:pPr>
-        <w:pStyle w:val="FirstParagraph"/>
-      </w:pPr>
-      <w:r>
-        <w:rPr>
-          <w:b/>
-        </w:rPr>
-        <w:t xml:space="preserve">[Prompt de Ilustración para Colorear - Pág. 13]:</w:t>
-      </w:r>
-      <w:r>
-        <w:br/>
-      </w:r>
-      <w:r>
-        <w:t xml:space="preserve">Luna consolando alegremente al pequeño erizo. Nico mostrando el mapa doradoy señalando el camino. Copito moviendo la cola. Dibujo claro, alegre y sin rellenos oscuros.</w:t>
       </w:r>
       <w:r>
         <w:t xml:space="preserve"> </w:t>
@@ -1030,11 +1080,11 @@
       <w:pPr>
         <w:pStyle w:val="Heading2"/>
       </w:pPr>
-      <w:bookmarkStart w:id="37" w:name="X7872ac79f20ea04019db02820dd301dbf65a270"/>
+      <w:bookmarkStart w:id="41" w:name="X7872ac79f20ea04019db02820dd301dbf65a270"/>
       <w:r>
         <w:t xml:space="preserve">[PÁGINA 14: ESCENA 11 - EL ARROYO DE PIEDRAS SONRIENTES]</w:t>
       </w:r>
-      <w:bookmarkEnd w:id="37"/>
+      <w:bookmarkEnd w:id="41"/>
     </w:p>
     <w:p>
       <w:pPr>
@@ -1071,23 +1121,6 @@
       </w:r>
       <w:r>
         <w:t xml:space="preserve">Nico, Luna y Copito cruzan saltando de piedra en piedra con cuidado.</w:t>
-      </w:r>
-    </w:p>
-    <w:p>
-      <w:pPr>
-        <w:pStyle w:val="FirstParagraph"/>
-      </w:pPr>
-      <w:r>
-        <w:rPr>
-          <w:b/>
-        </w:rPr>
-        <w:t xml:space="preserve">[Prompt de Ilustración para Colorear - Pág. 14]:</w:t>
-      </w:r>
-      <w:r>
-        <w:br/>
-      </w:r>
-      <w:r>
-        <w:t xml:space="preserve">Nico y Luna saltando alegremente de piedra en piedra sobre un arroyo transparente. Piedras redondas con expresiones de caritas sonrientes. El erizo viajando seguro en la mochila abierta de Nico. Líneas gruesas para colorear fácilmente.</w:t>
       </w:r>
     </w:p>
     <w:p>
@@ -1101,11 +1134,11 @@
       <w:pPr>
         <w:pStyle w:val="Heading2"/>
       </w:pPr>
-      <w:bookmarkStart w:id="38" w:name="X5e729eb630257606ba06e1985ac556c73fe62cb"/>
+      <w:bookmarkStart w:id="42" w:name="X5e729eb630257606ba06e1985ac556c73fe62cb"/>
       <w:r>
         <w:t xml:space="preserve">[PÁGINA 15: ESCENA 12 - LAS FLORES GIGANTES CANTANTES]</w:t>
       </w:r>
-      <w:bookmarkEnd w:id="38"/>
+      <w:bookmarkEnd w:id="42"/>
     </w:p>
     <w:p>
       <w:pPr>
@@ -1142,23 +1175,6 @@
       </w:r>
       <w:r>
         <w:t xml:space="preserve">Las flores gigantes cantan melodías que llenan el aire de alegría.</w:t>
-      </w:r>
-    </w:p>
-    <w:p>
-      <w:pPr>
-        <w:pStyle w:val="FirstParagraph"/>
-      </w:pPr>
-      <w:r>
-        <w:rPr>
-          <w:b/>
-        </w:rPr>
-        <w:t xml:space="preserve">[Prompt de Ilustración para Colorear - Pág. 15]:</w:t>
-      </w:r>
-      <w:r>
-        <w:br/>
-      </w:r>
-      <w:r>
-        <w:t xml:space="preserve">Flores gigantes de tallos ondulados con notas musicales sencillas flotando a su alrededor. Luna oliendo una gran flor mientras ríe. Nico y el erizo disfrutando la música. Dibujo limpio, contornos pronunciados.</w:t>
       </w:r>
     </w:p>
     <w:p>
@@ -1172,11 +1188,11 @@
       <w:pPr>
         <w:pStyle w:val="Heading2"/>
       </w:pPr>
-      <w:bookmarkStart w:id="39" w:name="X6feeff1fd072ee5a32a84b11433f1c6c3b1cbfa"/>
+      <w:bookmarkStart w:id="43" w:name="X6feeff1fd072ee5a32a84b11433f1c6c3b1cbfa"/>
       <w:r>
         <w:t xml:space="preserve">[PÁGINA 16: ESCENA 13 - COPITO Y LOS PÉTALOS MÁGICOS]</w:t>
       </w:r>
-      <w:bookmarkEnd w:id="39"/>
+      <w:bookmarkEnd w:id="43"/>
     </w:p>
     <w:p>
       <w:pPr>
@@ -1213,23 +1229,6 @@
       </w:r>
       <w:r>
         <w:t xml:space="preserve">¡Copito atrapa un pétalo volador justo en el aire!</w:t>
-      </w:r>
-    </w:p>
-    <w:p>
-      <w:pPr>
-        <w:pStyle w:val="FirstParagraph"/>
-      </w:pPr>
-      <w:r>
-        <w:rPr>
-          <w:b/>
-        </w:rPr>
-        <w:t xml:space="preserve">[Prompt de Ilustración para Colorear - Pág. 16]:</w:t>
-      </w:r>
-      <w:r>
-        <w:br/>
-      </w:r>
-      <w:r>
-        <w:t xml:space="preserve">Copito saltando en el aire intentando atrapar pétalos grandes de flor. Pétalos flotando suavemente. Hierba con mariquitas y flores pequeñas al fondo.</w:t>
       </w:r>
     </w:p>
     <w:p>
@@ -1243,11 +1242,11 @@
       <w:pPr>
         <w:pStyle w:val="Heading2"/>
       </w:pPr>
-      <w:bookmarkStart w:id="40" w:name="X09b7f08379a36fda53e2dfdbd907ca95f3850d2"/>
+      <w:bookmarkStart w:id="44" w:name="X09b7f08379a36fda53e2dfdbd907ca95f3850d2"/>
       <w:r>
         <w:t xml:space="preserve">[PÁGINA 17: ESCENA 14 - LOS CONEJITOS GUÍAS]</w:t>
       </w:r>
-      <w:bookmarkEnd w:id="40"/>
+      <w:bookmarkEnd w:id="44"/>
     </w:p>
     <w:p>
       <w:pPr>
@@ -1284,23 +1283,6 @@
       </w:r>
       <w:r>
         <w:t xml:space="preserve">—¡Gracias, amables conejitos! —dicen los niños al unísono.</w:t>
-      </w:r>
-    </w:p>
-    <w:p>
-      <w:pPr>
-        <w:pStyle w:val="FirstParagraph"/>
-      </w:pPr>
-      <w:r>
-        <w:rPr>
-          <w:b/>
-        </w:rPr>
-        <w:t xml:space="preserve">[Prompt de Ilustración para Colorear - Pág. 17]:</w:t>
-      </w:r>
-      <w:r>
-        <w:br/>
-      </w:r>
-      <w:r>
-        <w:t xml:space="preserve">Tres conejitos amigables de pie señalando hacia una colina arbolada. Nico, Luna y el erizo escuchando sus indicaciones. Paisaje despejado de fondo ideal para colorear.</w:t>
       </w:r>
     </w:p>
     <w:p>
@@ -1314,11 +1296,11 @@
       <w:pPr>
         <w:pStyle w:val="Heading2"/>
       </w:pPr>
-      <w:bookmarkStart w:id="41" w:name="X61065fc51c341dd52e7523e894470ec1372d706"/>
+      <w:bookmarkStart w:id="45" w:name="X61065fc51c341dd52e7523e894470ec1372d706"/>
       <w:r>
         <w:t xml:space="preserve">[PÁGINA 18: ESCENA 15 - LA CASITA DE TRONCOS Y MUSGO]</w:t>
       </w:r>
-      <w:bookmarkEnd w:id="41"/>
+      <w:bookmarkEnd w:id="45"/>
     </w:p>
     <w:p>
       <w:pPr>
@@ -1362,16 +1344,46 @@
         <w:pStyle w:val="FirstParagraph"/>
       </w:pPr>
       <w:r>
-        <w:rPr>
-          <w:b/>
-        </w:rPr>
-        <w:t xml:space="preserve">[Prompt de Ilustración para Colorear - Pág. 18]:</w:t>
-      </w:r>
-      <w:r>
-        <w:br/>
-      </w:r>
-      <w:r>
-        <w:t xml:space="preserve">Casita diminuta de madera y troncos con chimenea echando humo en espiral. Tejado pintoresco con musgo. El erizito corriendo feliz hacia la puerta abierta. Nico y Luna detrás sonriendo.</w:t>
+        <w:drawing>
+          <wp:inline>
+            <wp:extent cx="2731008" cy="3657600"/>
+            <wp:effectExtent b="0" l="0" r="0" t="0"/>
+            <wp:docPr descr="Página para Colorear 5: La Casita de Troncos del Erizo" title="" id="1" name="Picture"/>
+            <a:graphic>
+              <a:graphicData uri="http://schemas.openxmlformats.org/drawingml/2006/picture">
+                <pic:pic>
+                  <pic:nvPicPr>
+                    <pic:cNvPr descr="../images/coloring_page_5_casita.jpg" id="0" name="Picture"/>
+                    <pic:cNvPicPr>
+                      <a:picLocks noChangeArrowheads="1" noChangeAspect="1"/>
+                    </pic:cNvPicPr>
+                  </pic:nvPicPr>
+                  <pic:blipFill>
+                    <a:blip r:embed="rId46"/>
+                    <a:stretch>
+                      <a:fillRect/>
+                    </a:stretch>
+                  </pic:blipFill>
+                  <pic:spPr bwMode="auto">
+                    <a:xfrm>
+                      <a:off x="0" y="0"/>
+                      <a:ext cx="2731008" cy="3657600"/>
+                    </a:xfrm>
+                    <a:prstGeom prst="rect">
+                      <a:avLst/>
+                    </a:prstGeom>
+                    <a:noFill/>
+                    <a:ln w="9525">
+                      <a:noFill/>
+                      <a:headEnd/>
+                      <a:tailEnd/>
+                    </a:ln>
+                  </pic:spPr>
+                </pic:pic>
+              </a:graphicData>
+            </a:graphic>
+          </wp:inline>
+        </w:drawing>
       </w:r>
       <w:r>
         <w:t xml:space="preserve"> </w:t>
@@ -1391,11 +1403,11 @@
       <w:pPr>
         <w:pStyle w:val="Heading2"/>
       </w:pPr>
-      <w:bookmarkStart w:id="42" w:name="X777563082320865b2c4bfe1aed468213f63893f"/>
+      <w:bookmarkStart w:id="47" w:name="X777563082320865b2c4bfe1aed468213f63893f"/>
       <w:r>
         <w:t xml:space="preserve">[PÁGINA 19: ESCENA 16 - EL ABRAZO DE AGRADECIMIENTO]</w:t>
       </w:r>
-      <w:bookmarkEnd w:id="42"/>
+      <w:bookmarkEnd w:id="47"/>
     </w:p>
     <w:p>
       <w:pPr>
@@ -1462,11 +1474,11 @@
       <w:pPr>
         <w:pStyle w:val="Heading2"/>
       </w:pPr>
-      <w:bookmarkStart w:id="43" w:name="Xa875ad83482153a3c8a04160d43846d14ff90bb"/>
+      <w:bookmarkStart w:id="48" w:name="Xa875ad83482153a3c8a04160d43846d14ff90bb"/>
       <w:r>
         <w:t xml:space="preserve">[PÁGINA 20: ESCENA 17 - EL GRAN PICNIC DE FRUTAS]</w:t>
       </w:r>
-      <w:bookmarkEnd w:id="43"/>
+      <w:bookmarkEnd w:id="48"/>
     </w:p>
     <w:p>
       <w:pPr>
@@ -1533,11 +1545,11 @@
       <w:pPr>
         <w:pStyle w:val="Heading2"/>
       </w:pPr>
-      <w:bookmarkStart w:id="44" w:name="X3cba3ac5978981f78793d532fc67356ecd21eac"/>
+      <w:bookmarkStart w:id="49" w:name="X3cba3ac5978981f78793d532fc67356ecd21eac"/>
       <w:r>
         <w:t xml:space="preserve">[PÁGINA 21: ESCENA 18 - EL ATARDECER DORADO]</w:t>
       </w:r>
-      <w:bookmarkEnd w:id="44"/>
+      <w:bookmarkEnd w:id="49"/>
     </w:p>
     <w:p>
       <w:pPr>
@@ -1604,11 +1616,11 @@
       <w:pPr>
         <w:pStyle w:val="Heading2"/>
       </w:pPr>
-      <w:bookmarkStart w:id="45" w:name="X561a108b00931fdd31200f26fb13590743e76f8"/>
+      <w:bookmarkStart w:id="50" w:name="X561a108b00931fdd31200f26fb13590743e76f8"/>
       <w:r>
         <w:t xml:space="preserve">[PÁGINA 22: ESCENA 19 - LA DESPEDIDA DE LOS AMIGOS]</w:t>
       </w:r>
-      <w:bookmarkEnd w:id="45"/>
+      <w:bookmarkEnd w:id="50"/>
     </w:p>
     <w:p>
       <w:pPr>
@@ -1675,11 +1687,11 @@
       <w:pPr>
         <w:pStyle w:val="Heading2"/>
       </w:pPr>
-      <w:bookmarkStart w:id="46" w:name="página-23-escena-20---dormir-y-soñar"/>
+      <w:bookmarkStart w:id="51" w:name="página-23-escena-20---dormir-y-soñar"/>
       <w:r>
         <w:t xml:space="preserve">[PÁGINA 23: ESCENA 20 - DORMIR Y SOÑAR]</w:t>
       </w:r>
-      <w:bookmarkEnd w:id="46"/>
+      <w:bookmarkEnd w:id="51"/>
     </w:p>
     <w:p>
       <w:pPr>
@@ -1752,21 +1764,21 @@
       <w:pPr>
         <w:pStyle w:val="Heading2"/>
       </w:pPr>
-      <w:bookmarkStart w:id="47" w:name="Xd4828a2ee4306f4ecfba93b50598a4394033238"/>
+      <w:bookmarkStart w:id="52" w:name="Xd4828a2ee4306f4ecfba93b50598a4394033238"/>
       <w:r>
         <w:t xml:space="preserve">[PÁGINA 24: ACTIVIDAD 1 - EL LABERINTO DEL BOSQUE]</w:t>
       </w:r>
-      <w:bookmarkEnd w:id="47"/>
+      <w:bookmarkEnd w:id="52"/>
     </w:p>
     <w:p>
       <w:pPr>
         <w:pStyle w:val="Heading3"/>
       </w:pPr>
-      <w:bookmarkStart w:id="48" w:name="X5aae1f536c000372de23da93738dcb1f0eaa737"/>
+      <w:bookmarkStart w:id="53" w:name="X5aae1f536c000372de23da93738dcb1f0eaa737"/>
       <w:r>
         <w:t xml:space="preserve">🧩 ¡Ayuda a Nico y Luna a llegar a la Casita del Erizo!</w:t>
       </w:r>
-      <w:bookmarkEnd w:id="48"/>
+      <w:bookmarkEnd w:id="53"/>
     </w:p>
     <w:p>
       <w:pPr>
@@ -1804,21 +1816,21 @@
       <w:pPr>
         <w:pStyle w:val="Heading2"/>
       </w:pPr>
-      <w:bookmarkStart w:id="49" w:name="X12a829ecbf5d2abde5497887a5986fa076638e0"/>
+      <w:bookmarkStart w:id="54" w:name="X12a829ecbf5d2abde5497887a5986fa076638e0"/>
       <w:r>
         <w:t xml:space="preserve">[PÁGINA 25: ACTIVIDAD 2 - BUSCA LAS 5 DIFERENCIAS]</w:t>
       </w:r>
-      <w:bookmarkEnd w:id="49"/>
+      <w:bookmarkEnd w:id="54"/>
     </w:p>
     <w:p>
       <w:pPr>
         <w:pStyle w:val="Heading3"/>
       </w:pPr>
-      <w:bookmarkStart w:id="50" w:name="encuentra-las-5-diferencias"/>
+      <w:bookmarkStart w:id="55" w:name="encuentra-las-5-diferencias"/>
       <w:r>
         <w:t xml:space="preserve">🔍 ¡Encuentra las 5 diferencias!</w:t>
       </w:r>
-      <w:bookmarkEnd w:id="50"/>
+      <w:bookmarkEnd w:id="55"/>
     </w:p>
     <w:p>
       <w:pPr>
@@ -1916,21 +1928,21 @@
       <w:pPr>
         <w:pStyle w:val="Heading2"/>
       </w:pPr>
-      <w:bookmarkStart w:id="51" w:name="X90ca9bf5fb851b48e9b98c157f9f7a2cb83cda1"/>
+      <w:bookmarkStart w:id="56" w:name="X90ca9bf5fb851b48e9b98c157f9f7a2cb83cda1"/>
       <w:r>
         <w:t xml:space="preserve">[PÁGINA 26: ACTIVIDAD 3 - CONECTA LOS PUNTOS]</w:t>
       </w:r>
-      <w:bookmarkEnd w:id="51"/>
+      <w:bookmarkEnd w:id="56"/>
     </w:p>
     <w:p>
       <w:pPr>
         <w:pStyle w:val="Heading3"/>
       </w:pPr>
-      <w:bookmarkStart w:id="52" w:name="une-los-puntos-del-1-al-20"/>
+      <w:bookmarkStart w:id="57" w:name="une-los-puntos-del-1-al-20"/>
       <w:r>
         <w:t xml:space="preserve">✏️ ¡Une los puntos del 1 al 20!</w:t>
       </w:r>
-      <w:bookmarkEnd w:id="52"/>
+      <w:bookmarkEnd w:id="57"/>
     </w:p>
     <w:p>
       <w:pPr>
@@ -1985,21 +1997,21 @@
       <w:pPr>
         <w:pStyle w:val="Heading2"/>
       </w:pPr>
-      <w:bookmarkStart w:id="53" w:name="Xd2a239ba12c22b3e1d2c84e7e366ddd17dc2af9"/>
+      <w:bookmarkStart w:id="58" w:name="Xd2a239ba12c22b3e1d2c84e7e366ddd17dc2af9"/>
       <w:r>
         <w:t xml:space="preserve">[PÁGINA 27: ACTIVIDAD 4 - DIBUJO Y CREATIVIDAD LIBRE]</w:t>
       </w:r>
-      <w:bookmarkEnd w:id="53"/>
+      <w:bookmarkEnd w:id="58"/>
     </w:p>
     <w:p>
       <w:pPr>
         <w:pStyle w:val="Heading3"/>
       </w:pPr>
-      <w:bookmarkStart w:id="54" w:name="X736eb4d204c2da0c526ce41c2d1a4eb5c6dce7e"/>
+      <w:bookmarkStart w:id="59" w:name="X736eb4d204c2da0c526ce41c2d1a4eb5c6dce7e"/>
       <w:r>
         <w:t xml:space="preserve">🎨 ¡Diseña tu propia Criatura Mágica del Bosque!</w:t>
       </w:r>
-      <w:bookmarkEnd w:id="54"/>
+      <w:bookmarkEnd w:id="59"/>
     </w:p>
     <w:p>
       <w:pPr>
@@ -2069,41 +2081,41 @@
       <w:pPr>
         <w:pStyle w:val="Heading2"/>
       </w:pPr>
-      <w:bookmarkStart w:id="55" w:name="Xf52ef01bc6627b2dc63dd461bda53022a077698"/>
+      <w:bookmarkStart w:id="60" w:name="Xf52ef01bc6627b2dc63dd461bda53022a077698"/>
       <w:r>
         <w:t xml:space="preserve">[PÁGINA 28: AVANCE DEL SIGUIENTE LIBRO DE LA COLECCIÓN]</w:t>
       </w:r>
-      <w:bookmarkEnd w:id="55"/>
+      <w:bookmarkEnd w:id="60"/>
     </w:p>
     <w:p>
       <w:pPr>
         <w:pStyle w:val="Heading3"/>
       </w:pPr>
-      <w:bookmarkStart w:id="56" w:name="próxima-aventura"/>
+      <w:bookmarkStart w:id="61" w:name="próxima-aventura"/>
       <w:r>
         <w:t xml:space="preserve">🚀 ¡Próxima Aventura!</w:t>
       </w:r>
-      <w:bookmarkEnd w:id="56"/>
+      <w:bookmarkEnd w:id="61"/>
     </w:p>
     <w:p>
       <w:pPr>
         <w:pStyle w:val="Heading3"/>
       </w:pPr>
-      <w:bookmarkStart w:id="57" w:name="las-aventuras-de-nico-y-luna-libro-2"/>
+      <w:bookmarkStart w:id="62" w:name="las-aventuras-de-nico-y-luna-libro-2"/>
       <w:r>
         <w:t xml:space="preserve">LAS AVENTURAS DE NICO Y LUNA — LIBRO 2</w:t>
       </w:r>
-      <w:bookmarkEnd w:id="57"/>
+      <w:bookmarkEnd w:id="62"/>
     </w:p>
     <w:p>
       <w:pPr>
         <w:pStyle w:val="Heading2"/>
       </w:pPr>
-      <w:bookmarkStart w:id="58" w:name="viaje-al-espacio"/>
+      <w:bookmarkStart w:id="63" w:name="viaje-al-espacio"/>
       <w:r>
         <w:t xml:space="preserve">Viaje al Espacio</w:t>
       </w:r>
-      <w:bookmarkEnd w:id="58"/>
+      <w:bookmarkEnd w:id="63"/>
     </w:p>
     <w:p>
       <w:pPr>
@@ -2158,21 +2170,21 @@
       <w:pPr>
         <w:pStyle w:val="Heading2"/>
       </w:pPr>
-      <w:bookmarkStart w:id="59" w:name="página-29-probador-de-colores"/>
+      <w:bookmarkStart w:id="64" w:name="página-29-probador-de-colores"/>
       <w:r>
         <w:t xml:space="preserve">[PÁGINA 29: PROBADOR DE COLORES]</w:t>
       </w:r>
-      <w:bookmarkEnd w:id="59"/>
+      <w:bookmarkEnd w:id="64"/>
     </w:p>
     <w:p>
       <w:pPr>
         <w:pStyle w:val="Heading3"/>
       </w:pPr>
-      <w:bookmarkStart w:id="60" w:name="probador-de-colores-y-rotuladores"/>
+      <w:bookmarkStart w:id="65" w:name="probador-de-colores-y-rotuladores"/>
       <w:r>
         <w:t xml:space="preserve">🖍️ Probador de Colores y Rotuladores</w:t>
       </w:r>
-      <w:bookmarkEnd w:id="60"/>
+      <w:bookmarkEnd w:id="65"/>
     </w:p>
     <w:p>
       <w:pPr>
@@ -2239,21 +2251,21 @@
       <w:pPr>
         <w:pStyle w:val="Heading2"/>
       </w:pPr>
-      <w:bookmarkStart w:id="61" w:name="página-30-solucionario-de-actividades"/>
+      <w:bookmarkStart w:id="66" w:name="página-30-solucionario-de-actividades"/>
       <w:r>
         <w:t xml:space="preserve">[PÁGINA 30: SOLUCIONARIO DE ACTIVIDADES]</w:t>
       </w:r>
-      <w:bookmarkEnd w:id="61"/>
+      <w:bookmarkEnd w:id="66"/>
     </w:p>
     <w:p>
       <w:pPr>
         <w:pStyle w:val="Heading3"/>
       </w:pPr>
-      <w:bookmarkStart w:id="62" w:name="soluciones-de-los-juegos"/>
+      <w:bookmarkStart w:id="67" w:name="soluciones-de-los-juegos"/>
       <w:r>
         <w:t xml:space="preserve">💡 Soluciones de los Juegos</w:t>
       </w:r>
-      <w:bookmarkEnd w:id="62"/>
+      <w:bookmarkEnd w:id="67"/>
     </w:p>
     <w:p>
       <w:pPr>

</xml_diff>